<commit_message>
Add simulated supplementary files S1-S5 with consistency audit
S1 interview guides and forms, S2 COREQ checklist, S3 site profiles,
S4 analytic trace, S5 GRIPP2 short form, an audit README with an internal
participant key, and a script that cross-checks the Findings against the
supplementary files. Build script generalised for landscape tables and
Arabic text; N01 quotation now marks its omitted line with an ellipsis.

Co-Authored-By: Claude Opus 5.5 <noreply@anthropic.com>
Claude-Session: https://claude.ai/code/session_01JoLDLQdfMugj21P1vAEaKZ
</commit_message>
<xml_diff>
--- a/educational_simulation/Findings_Mobilisation_Emergency_Caesarean_SIMULATED.docx
+++ b/educational_simulation/Findings_Mobilisation_Emergency_Caesarean_SIMULATED.docx
@@ -185,6 +185,7 @@
       </w:tblGrid>
       <w:tr>
         <w:trPr>
+          <w:cantSplit w:val="false"/>
           <w:tblHeader/>
         </w:trPr>
         <w:tc>
@@ -206,7 +207,7 @@
           </w:tcPr>
           <w:p>
             <w:pPr>
-              <w:jc w:val="left"/>
+              <w:spacing w:after="40"/>
             </w:pPr>
             <w:r>
               <w:rPr>
@@ -238,7 +239,7 @@
           </w:tcPr>
           <w:p>
             <w:pPr>
-              <w:jc w:val="left"/>
+              <w:spacing w:after="40"/>
             </w:pPr>
             <w:r>
               <w:rPr>
@@ -270,7 +271,7 @@
           </w:tcPr>
           <w:p>
             <w:pPr>
-              <w:jc w:val="center"/>
+              <w:spacing w:after="40"/>
             </w:pPr>
             <w:r>
               <w:rPr>
@@ -302,7 +303,7 @@
           </w:tcPr>
           <w:p>
             <w:pPr>
-              <w:jc w:val="center"/>
+              <w:spacing w:after="40"/>
             </w:pPr>
             <w:r>
               <w:rPr>
@@ -334,7 +335,7 @@
           </w:tcPr>
           <w:p>
             <w:pPr>
-              <w:jc w:val="center"/>
+              <w:spacing w:after="40"/>
             </w:pPr>
             <w:r>
               <w:rPr>
@@ -350,6 +351,7 @@
       </w:tr>
       <w:tr>
         <w:trPr>
+          <w:cantSplit/>
           <w:tblHeader w:val="false"/>
         </w:trPr>
         <w:tc>
@@ -370,7 +372,7 @@
           </w:tcPr>
           <w:p>
             <w:pPr>
-              <w:jc w:val="left"/>
+              <w:spacing w:after="40"/>
             </w:pPr>
             <w:r>
               <w:rPr>
@@ -399,7 +401,7 @@
           </w:tcPr>
           <w:p>
             <w:pPr>
-              <w:jc w:val="left"/>
+              <w:spacing w:after="40"/>
             </w:pPr>
             <w:r>
               <w:rPr>
@@ -428,7 +430,7 @@
           </w:tcPr>
           <w:p>
             <w:pPr>
-              <w:jc w:val="center"/>
+              <w:spacing w:after="40"/>
             </w:pPr>
             <w:r>
               <w:rPr>
@@ -457,7 +459,7 @@
           </w:tcPr>
           <w:p>
             <w:pPr>
-              <w:jc w:val="center"/>
+              <w:spacing w:after="40"/>
             </w:pPr>
             <w:r>
               <w:rPr>
@@ -486,7 +488,7 @@
           </w:tcPr>
           <w:p>
             <w:pPr>
-              <w:jc w:val="center"/>
+              <w:spacing w:after="40"/>
             </w:pPr>
             <w:r>
               <w:rPr>
@@ -500,6 +502,7 @@
       </w:tr>
       <w:tr>
         <w:trPr>
+          <w:cantSplit/>
           <w:tblHeader w:val="false"/>
         </w:trPr>
         <w:tc>
@@ -520,7 +523,7 @@
           </w:tcPr>
           <w:p>
             <w:pPr>
-              <w:jc w:val="left"/>
+              <w:spacing w:after="40"/>
             </w:pPr>
           </w:p>
         </w:tc>
@@ -542,7 +545,7 @@
           </w:tcPr>
           <w:p>
             <w:pPr>
-              <w:jc w:val="left"/>
+              <w:spacing w:after="40"/>
             </w:pPr>
             <w:r>
               <w:rPr>
@@ -571,7 +574,7 @@
           </w:tcPr>
           <w:p>
             <w:pPr>
-              <w:jc w:val="center"/>
+              <w:spacing w:after="40"/>
             </w:pPr>
             <w:r>
               <w:rPr>
@@ -600,7 +603,7 @@
           </w:tcPr>
           <w:p>
             <w:pPr>
-              <w:jc w:val="center"/>
+              <w:spacing w:after="40"/>
             </w:pPr>
             <w:r>
               <w:rPr>
@@ -629,7 +632,7 @@
           </w:tcPr>
           <w:p>
             <w:pPr>
-              <w:jc w:val="center"/>
+              <w:spacing w:after="40"/>
             </w:pPr>
             <w:r>
               <w:rPr>
@@ -643,6 +646,7 @@
       </w:tr>
       <w:tr>
         <w:trPr>
+          <w:cantSplit/>
           <w:tblHeader w:val="false"/>
         </w:trPr>
         <w:tc>
@@ -663,7 +667,7 @@
           </w:tcPr>
           <w:p>
             <w:pPr>
-              <w:jc w:val="left"/>
+              <w:spacing w:after="40"/>
             </w:pPr>
           </w:p>
         </w:tc>
@@ -685,7 +689,7 @@
           </w:tcPr>
           <w:p>
             <w:pPr>
-              <w:jc w:val="left"/>
+              <w:spacing w:after="40"/>
             </w:pPr>
             <w:r>
               <w:rPr>
@@ -714,7 +718,7 @@
           </w:tcPr>
           <w:p>
             <w:pPr>
-              <w:jc w:val="center"/>
+              <w:spacing w:after="40"/>
             </w:pPr>
             <w:r>
               <w:rPr>
@@ -743,7 +747,7 @@
           </w:tcPr>
           <w:p>
             <w:pPr>
-              <w:jc w:val="center"/>
+              <w:spacing w:after="40"/>
             </w:pPr>
             <w:r>
               <w:rPr>
@@ -772,7 +776,7 @@
           </w:tcPr>
           <w:p>
             <w:pPr>
-              <w:jc w:val="center"/>
+              <w:spacing w:after="40"/>
             </w:pPr>
             <w:r>
               <w:rPr>
@@ -786,6 +790,7 @@
       </w:tr>
       <w:tr>
         <w:trPr>
+          <w:cantSplit/>
           <w:tblHeader w:val="false"/>
         </w:trPr>
         <w:tc>
@@ -806,7 +811,7 @@
           </w:tcPr>
           <w:p>
             <w:pPr>
-              <w:jc w:val="left"/>
+              <w:spacing w:after="40"/>
             </w:pPr>
             <w:r>
               <w:rPr>
@@ -835,7 +840,7 @@
           </w:tcPr>
           <w:p>
             <w:pPr>
-              <w:jc w:val="left"/>
+              <w:spacing w:after="40"/>
             </w:pPr>
             <w:r>
               <w:rPr>
@@ -864,7 +869,7 @@
           </w:tcPr>
           <w:p>
             <w:pPr>
-              <w:jc w:val="center"/>
+              <w:spacing w:after="40"/>
             </w:pPr>
             <w:r>
               <w:rPr>
@@ -893,7 +898,7 @@
           </w:tcPr>
           <w:p>
             <w:pPr>
-              <w:jc w:val="center"/>
+              <w:spacing w:after="40"/>
             </w:pPr>
             <w:r>
               <w:rPr>
@@ -922,7 +927,7 @@
           </w:tcPr>
           <w:p>
             <w:pPr>
-              <w:jc w:val="center"/>
+              <w:spacing w:after="40"/>
             </w:pPr>
             <w:r>
               <w:rPr>
@@ -936,6 +941,7 @@
       </w:tr>
       <w:tr>
         <w:trPr>
+          <w:cantSplit/>
           <w:tblHeader w:val="false"/>
         </w:trPr>
         <w:tc>
@@ -956,7 +962,7 @@
           </w:tcPr>
           <w:p>
             <w:pPr>
-              <w:jc w:val="left"/>
+              <w:spacing w:after="40"/>
             </w:pPr>
           </w:p>
         </w:tc>
@@ -978,7 +984,7 @@
           </w:tcPr>
           <w:p>
             <w:pPr>
-              <w:jc w:val="left"/>
+              <w:spacing w:after="40"/>
             </w:pPr>
             <w:r>
               <w:rPr>
@@ -1007,7 +1013,7 @@
           </w:tcPr>
           <w:p>
             <w:pPr>
-              <w:jc w:val="center"/>
+              <w:spacing w:after="40"/>
             </w:pPr>
             <w:r>
               <w:rPr>
@@ -1036,7 +1042,7 @@
           </w:tcPr>
           <w:p>
             <w:pPr>
-              <w:jc w:val="center"/>
+              <w:spacing w:after="40"/>
             </w:pPr>
             <w:r>
               <w:rPr>
@@ -1065,7 +1071,7 @@
           </w:tcPr>
           <w:p>
             <w:pPr>
-              <w:jc w:val="center"/>
+              <w:spacing w:after="40"/>
             </w:pPr>
             <w:r>
               <w:rPr>
@@ -1079,6 +1085,7 @@
       </w:tr>
       <w:tr>
         <w:trPr>
+          <w:cantSplit/>
           <w:tblHeader w:val="false"/>
         </w:trPr>
         <w:tc>
@@ -1099,7 +1106,7 @@
           </w:tcPr>
           <w:p>
             <w:pPr>
-              <w:jc w:val="left"/>
+              <w:spacing w:after="40"/>
             </w:pPr>
           </w:p>
         </w:tc>
@@ -1121,7 +1128,7 @@
           </w:tcPr>
           <w:p>
             <w:pPr>
-              <w:jc w:val="left"/>
+              <w:spacing w:after="40"/>
             </w:pPr>
             <w:r>
               <w:rPr>
@@ -1150,7 +1157,7 @@
           </w:tcPr>
           <w:p>
             <w:pPr>
-              <w:jc w:val="center"/>
+              <w:spacing w:after="40"/>
             </w:pPr>
             <w:r>
               <w:rPr>
@@ -1179,7 +1186,7 @@
           </w:tcPr>
           <w:p>
             <w:pPr>
-              <w:jc w:val="center"/>
+              <w:spacing w:after="40"/>
             </w:pPr>
             <w:r>
               <w:rPr>
@@ -1208,7 +1215,7 @@
           </w:tcPr>
           <w:p>
             <w:pPr>
-              <w:jc w:val="center"/>
+              <w:spacing w:after="40"/>
             </w:pPr>
             <w:r>
               <w:rPr>
@@ -1222,6 +1229,7 @@
       </w:tr>
       <w:tr>
         <w:trPr>
+          <w:cantSplit/>
           <w:tblHeader w:val="false"/>
         </w:trPr>
         <w:tc>
@@ -1242,7 +1250,7 @@
           </w:tcPr>
           <w:p>
             <w:pPr>
-              <w:jc w:val="left"/>
+              <w:spacing w:after="40"/>
             </w:pPr>
             <w:r>
               <w:rPr>
@@ -1271,7 +1279,7 @@
           </w:tcPr>
           <w:p>
             <w:pPr>
-              <w:jc w:val="left"/>
+              <w:spacing w:after="40"/>
             </w:pPr>
             <w:r>
               <w:rPr>
@@ -1300,7 +1308,7 @@
           </w:tcPr>
           <w:p>
             <w:pPr>
-              <w:jc w:val="center"/>
+              <w:spacing w:after="40"/>
             </w:pPr>
             <w:r>
               <w:rPr>
@@ -1329,7 +1337,7 @@
           </w:tcPr>
           <w:p>
             <w:pPr>
-              <w:jc w:val="center"/>
+              <w:spacing w:after="40"/>
             </w:pPr>
             <w:r>
               <w:rPr>
@@ -1358,7 +1366,7 @@
           </w:tcPr>
           <w:p>
             <w:pPr>
-              <w:jc w:val="center"/>
+              <w:spacing w:after="40"/>
             </w:pPr>
             <w:r>
               <w:rPr>
@@ -1372,6 +1380,7 @@
       </w:tr>
       <w:tr>
         <w:trPr>
+          <w:cantSplit/>
           <w:tblHeader w:val="false"/>
         </w:trPr>
         <w:tc>
@@ -1392,7 +1401,7 @@
           </w:tcPr>
           <w:p>
             <w:pPr>
-              <w:jc w:val="left"/>
+              <w:spacing w:after="40"/>
             </w:pPr>
           </w:p>
         </w:tc>
@@ -1414,7 +1423,7 @@
           </w:tcPr>
           <w:p>
             <w:pPr>
-              <w:jc w:val="left"/>
+              <w:spacing w:after="40"/>
             </w:pPr>
             <w:r>
               <w:rPr>
@@ -1443,7 +1452,7 @@
           </w:tcPr>
           <w:p>
             <w:pPr>
-              <w:jc w:val="center"/>
+              <w:spacing w:after="40"/>
             </w:pPr>
             <w:r>
               <w:rPr>
@@ -1472,7 +1481,7 @@
           </w:tcPr>
           <w:p>
             <w:pPr>
-              <w:jc w:val="center"/>
+              <w:spacing w:after="40"/>
             </w:pPr>
             <w:r>
               <w:rPr>
@@ -1501,7 +1510,7 @@
           </w:tcPr>
           <w:p>
             <w:pPr>
-              <w:jc w:val="center"/>
+              <w:spacing w:after="40"/>
             </w:pPr>
             <w:r>
               <w:rPr>
@@ -1515,6 +1524,7 @@
       </w:tr>
       <w:tr>
         <w:trPr>
+          <w:cantSplit/>
           <w:tblHeader w:val="false"/>
         </w:trPr>
         <w:tc>
@@ -1535,7 +1545,7 @@
           </w:tcPr>
           <w:p>
             <w:pPr>
-              <w:jc w:val="left"/>
+              <w:spacing w:after="40"/>
             </w:pPr>
           </w:p>
         </w:tc>
@@ -1557,7 +1567,7 @@
           </w:tcPr>
           <w:p>
             <w:pPr>
-              <w:jc w:val="left"/>
+              <w:spacing w:after="40"/>
             </w:pPr>
             <w:r>
               <w:rPr>
@@ -1586,7 +1596,7 @@
           </w:tcPr>
           <w:p>
             <w:pPr>
-              <w:jc w:val="center"/>
+              <w:spacing w:after="40"/>
             </w:pPr>
             <w:r>
               <w:rPr>
@@ -1615,7 +1625,7 @@
           </w:tcPr>
           <w:p>
             <w:pPr>
-              <w:jc w:val="center"/>
+              <w:spacing w:after="40"/>
             </w:pPr>
             <w:r>
               <w:rPr>
@@ -1644,7 +1654,7 @@
           </w:tcPr>
           <w:p>
             <w:pPr>
-              <w:jc w:val="center"/>
+              <w:spacing w:after="40"/>
             </w:pPr>
             <w:r>
               <w:rPr>
@@ -1709,18 +1719,19 @@
         </w:tblBorders>
       </w:tblPr>
       <w:tblGrid>
-        <w:gridCol w:w="4641"/>
-        <w:gridCol w:w="1035"/>
-        <w:gridCol w:w="1050"/>
-        <w:gridCol w:w="2300"/>
+        <w:gridCol w:w="5731"/>
+        <w:gridCol w:w="784"/>
+        <w:gridCol w:w="863"/>
+        <w:gridCol w:w="1648"/>
       </w:tblGrid>
       <w:tr>
         <w:trPr>
+          <w:cantSplit w:val="false"/>
           <w:tblHeader/>
         </w:trPr>
         <w:tc>
           <w:tcPr>
-            <w:tcW w:type="dxa" w:w="4641"/>
+            <w:tcW w:type="dxa" w:w="5731"/>
             <w:tcBorders>
               <w:top w:val="single" w:color="999999" w:sz="4"/>
               <w:left w:val="single" w:color="999999" w:sz="4"/>
@@ -1737,7 +1748,7 @@
           </w:tcPr>
           <w:p>
             <w:pPr>
-              <w:jc w:val="left"/>
+              <w:spacing w:after="40"/>
             </w:pPr>
             <w:r>
               <w:rPr>
@@ -1752,7 +1763,7 @@
         </w:tc>
         <w:tc>
           <w:tcPr>
-            <w:tcW w:type="dxa" w:w="1035"/>
+            <w:tcW w:type="dxa" w:w="784"/>
             <w:tcBorders>
               <w:top w:val="single" w:color="999999" w:sz="4"/>
               <w:left w:val="single" w:color="999999" w:sz="4"/>
@@ -1769,7 +1780,7 @@
           </w:tcPr>
           <w:p>
             <w:pPr>
-              <w:jc w:val="center"/>
+              <w:spacing w:after="40"/>
             </w:pPr>
             <w:r>
               <w:rPr>
@@ -1784,7 +1795,7 @@
         </w:tc>
         <w:tc>
           <w:tcPr>
-            <w:tcW w:type="dxa" w:w="1050"/>
+            <w:tcW w:type="dxa" w:w="863"/>
             <w:tcBorders>
               <w:top w:val="single" w:color="999999" w:sz="4"/>
               <w:left w:val="single" w:color="999999" w:sz="4"/>
@@ -1801,7 +1812,7 @@
           </w:tcPr>
           <w:p>
             <w:pPr>
-              <w:jc w:val="center"/>
+              <w:spacing w:after="40"/>
             </w:pPr>
             <w:r>
               <w:rPr>
@@ -1816,7 +1827,7 @@
         </w:tc>
         <w:tc>
           <w:tcPr>
-            <w:tcW w:type="dxa" w:w="2300"/>
+            <w:tcW w:type="dxa" w:w="1648"/>
             <w:tcBorders>
               <w:top w:val="single" w:color="999999" w:sz="4"/>
               <w:left w:val="single" w:color="999999" w:sz="4"/>
@@ -1833,7 +1844,7 @@
           </w:tcPr>
           <w:p>
             <w:pPr>
-              <w:jc w:val="center"/>
+              <w:spacing w:after="40"/>
             </w:pPr>
             <w:r>
               <w:rPr>
@@ -1849,27 +1860,28 @@
       </w:tr>
       <w:tr>
         <w:trPr>
+          <w:cantSplit/>
           <w:tblHeader w:val="false"/>
         </w:trPr>
         <w:tc>
           <w:tcPr>
-            <w:tcW w:type="dxa" w:w="4641"/>
-            <w:tcBorders>
-              <w:top w:val="single" w:color="999999" w:sz="4"/>
-              <w:left w:val="single" w:color="999999" w:sz="4"/>
-              <w:bottom w:val="single" w:color="999999" w:sz="4"/>
-              <w:right w:val="single" w:color="999999" w:sz="4"/>
-            </w:tcBorders>
-            <w:tcMar>
-              <w:top w:type="dxa" w:w="60"/>
-              <w:left w:type="dxa" w:w="100"/>
-              <w:bottom w:type="dxa" w:w="60"/>
-              <w:right w:type="dxa" w:w="100"/>
-            </w:tcMar>
-          </w:tcPr>
-          <w:p>
-            <w:pPr>
-              <w:jc w:val="left"/>
+            <w:tcW w:type="dxa" w:w="5731"/>
+            <w:tcBorders>
+              <w:top w:val="single" w:color="999999" w:sz="4"/>
+              <w:left w:val="single" w:color="999999" w:sz="4"/>
+              <w:bottom w:val="single" w:color="999999" w:sz="4"/>
+              <w:right w:val="single" w:color="999999" w:sz="4"/>
+            </w:tcBorders>
+            <w:tcMar>
+              <w:top w:type="dxa" w:w="60"/>
+              <w:left w:type="dxa" w:w="100"/>
+              <w:bottom w:type="dxa" w:w="60"/>
+              <w:right w:type="dxa" w:w="100"/>
+            </w:tcMar>
+          </w:tcPr>
+          <w:p>
+            <w:pPr>
+              <w:spacing w:after="40"/>
             </w:pPr>
             <w:r>
               <w:rPr>
@@ -1882,23 +1894,23 @@
         </w:tc>
         <w:tc>
           <w:tcPr>
-            <w:tcW w:type="dxa" w:w="1035"/>
-            <w:tcBorders>
-              <w:top w:val="single" w:color="999999" w:sz="4"/>
-              <w:left w:val="single" w:color="999999" w:sz="4"/>
-              <w:bottom w:val="single" w:color="999999" w:sz="4"/>
-              <w:right w:val="single" w:color="999999" w:sz="4"/>
-            </w:tcBorders>
-            <w:tcMar>
-              <w:top w:type="dxa" w:w="60"/>
-              <w:left w:type="dxa" w:w="100"/>
-              <w:bottom w:type="dxa" w:w="60"/>
-              <w:right w:type="dxa" w:w="100"/>
-            </w:tcMar>
-          </w:tcPr>
-          <w:p>
-            <w:pPr>
-              <w:jc w:val="center"/>
+            <w:tcW w:type="dxa" w:w="784"/>
+            <w:tcBorders>
+              <w:top w:val="single" w:color="999999" w:sz="4"/>
+              <w:left w:val="single" w:color="999999" w:sz="4"/>
+              <w:bottom w:val="single" w:color="999999" w:sz="4"/>
+              <w:right w:val="single" w:color="999999" w:sz="4"/>
+            </w:tcBorders>
+            <w:tcMar>
+              <w:top w:type="dxa" w:w="60"/>
+              <w:left w:type="dxa" w:w="100"/>
+              <w:bottom w:type="dxa" w:w="60"/>
+              <w:right w:type="dxa" w:w="100"/>
+            </w:tcMar>
+          </w:tcPr>
+          <w:p>
+            <w:pPr>
+              <w:spacing w:after="40"/>
             </w:pPr>
             <w:r>
               <w:rPr>
@@ -1911,23 +1923,23 @@
         </w:tc>
         <w:tc>
           <w:tcPr>
-            <w:tcW w:type="dxa" w:w="1050"/>
-            <w:tcBorders>
-              <w:top w:val="single" w:color="999999" w:sz="4"/>
-              <w:left w:val="single" w:color="999999" w:sz="4"/>
-              <w:bottom w:val="single" w:color="999999" w:sz="4"/>
-              <w:right w:val="single" w:color="999999" w:sz="4"/>
-            </w:tcBorders>
-            <w:tcMar>
-              <w:top w:type="dxa" w:w="60"/>
-              <w:left w:type="dxa" w:w="100"/>
-              <w:bottom w:type="dxa" w:w="60"/>
-              <w:right w:type="dxa" w:w="100"/>
-            </w:tcMar>
-          </w:tcPr>
-          <w:p>
-            <w:pPr>
-              <w:jc w:val="center"/>
+            <w:tcW w:type="dxa" w:w="863"/>
+            <w:tcBorders>
+              <w:top w:val="single" w:color="999999" w:sz="4"/>
+              <w:left w:val="single" w:color="999999" w:sz="4"/>
+              <w:bottom w:val="single" w:color="999999" w:sz="4"/>
+              <w:right w:val="single" w:color="999999" w:sz="4"/>
+            </w:tcBorders>
+            <w:tcMar>
+              <w:top w:type="dxa" w:w="60"/>
+              <w:left w:type="dxa" w:w="100"/>
+              <w:bottom w:type="dxa" w:w="60"/>
+              <w:right w:type="dxa" w:w="100"/>
+            </w:tcMar>
+          </w:tcPr>
+          <w:p>
+            <w:pPr>
+              <w:spacing w:after="40"/>
             </w:pPr>
             <w:r>
               <w:rPr>
@@ -1940,23 +1952,23 @@
         </w:tc>
         <w:tc>
           <w:tcPr>
-            <w:tcW w:type="dxa" w:w="2300"/>
-            <w:tcBorders>
-              <w:top w:val="single" w:color="999999" w:sz="4"/>
-              <w:left w:val="single" w:color="999999" w:sz="4"/>
-              <w:bottom w:val="single" w:color="999999" w:sz="4"/>
-              <w:right w:val="single" w:color="999999" w:sz="4"/>
-            </w:tcBorders>
-            <w:tcMar>
-              <w:top w:type="dxa" w:w="60"/>
-              <w:left w:type="dxa" w:w="100"/>
-              <w:bottom w:type="dxa" w:w="60"/>
-              <w:right w:type="dxa" w:w="100"/>
-            </w:tcMar>
-          </w:tcPr>
-          <w:p>
-            <w:pPr>
-              <w:jc w:val="center"/>
+            <w:tcW w:type="dxa" w:w="1648"/>
+            <w:tcBorders>
+              <w:top w:val="single" w:color="999999" w:sz="4"/>
+              <w:left w:val="single" w:color="999999" w:sz="4"/>
+              <w:bottom w:val="single" w:color="999999" w:sz="4"/>
+              <w:right w:val="single" w:color="999999" w:sz="4"/>
+            </w:tcBorders>
+            <w:tcMar>
+              <w:top w:type="dxa" w:w="60"/>
+              <w:left w:type="dxa" w:w="100"/>
+              <w:bottom w:type="dxa" w:w="60"/>
+              <w:right w:type="dxa" w:w="100"/>
+            </w:tcMar>
+          </w:tcPr>
+          <w:p>
+            <w:pPr>
+              <w:spacing w:after="40"/>
             </w:pPr>
             <w:r>
               <w:rPr>
@@ -1970,27 +1982,28 @@
       </w:tr>
       <w:tr>
         <w:trPr>
+          <w:cantSplit/>
           <w:tblHeader w:val="false"/>
         </w:trPr>
         <w:tc>
           <w:tcPr>
-            <w:tcW w:type="dxa" w:w="4641"/>
-            <w:tcBorders>
-              <w:top w:val="single" w:color="999999" w:sz="4"/>
-              <w:left w:val="single" w:color="999999" w:sz="4"/>
-              <w:bottom w:val="single" w:color="999999" w:sz="4"/>
-              <w:right w:val="single" w:color="999999" w:sz="4"/>
-            </w:tcBorders>
-            <w:tcMar>
-              <w:top w:type="dxa" w:w="60"/>
-              <w:left w:type="dxa" w:w="100"/>
-              <w:bottom w:type="dxa" w:w="60"/>
-              <w:right w:type="dxa" w:w="100"/>
-            </w:tcMar>
-          </w:tcPr>
-          <w:p>
-            <w:pPr>
-              <w:jc w:val="left"/>
+            <w:tcW w:type="dxa" w:w="5731"/>
+            <w:tcBorders>
+              <w:top w:val="single" w:color="999999" w:sz="4"/>
+              <w:left w:val="single" w:color="999999" w:sz="4"/>
+              <w:bottom w:val="single" w:color="999999" w:sz="4"/>
+              <w:right w:val="single" w:color="999999" w:sz="4"/>
+            </w:tcBorders>
+            <w:tcMar>
+              <w:top w:type="dxa" w:w="60"/>
+              <w:left w:type="dxa" w:w="100"/>
+              <w:bottom w:type="dxa" w:w="60"/>
+              <w:right w:type="dxa" w:w="100"/>
+            </w:tcMar>
+          </w:tcPr>
+          <w:p>
+            <w:pPr>
+              <w:spacing w:after="40"/>
             </w:pPr>
             <w:r>
               <w:rPr>
@@ -2003,23 +2016,23 @@
         </w:tc>
         <w:tc>
           <w:tcPr>
-            <w:tcW w:type="dxa" w:w="1035"/>
-            <w:tcBorders>
-              <w:top w:val="single" w:color="999999" w:sz="4"/>
-              <w:left w:val="single" w:color="999999" w:sz="4"/>
-              <w:bottom w:val="single" w:color="999999" w:sz="4"/>
-              <w:right w:val="single" w:color="999999" w:sz="4"/>
-            </w:tcBorders>
-            <w:tcMar>
-              <w:top w:type="dxa" w:w="60"/>
-              <w:left w:type="dxa" w:w="100"/>
-              <w:bottom w:type="dxa" w:w="60"/>
-              <w:right w:type="dxa" w:w="100"/>
-            </w:tcMar>
-          </w:tcPr>
-          <w:p>
-            <w:pPr>
-              <w:jc w:val="center"/>
+            <w:tcW w:type="dxa" w:w="784"/>
+            <w:tcBorders>
+              <w:top w:val="single" w:color="999999" w:sz="4"/>
+              <w:left w:val="single" w:color="999999" w:sz="4"/>
+              <w:bottom w:val="single" w:color="999999" w:sz="4"/>
+              <w:right w:val="single" w:color="999999" w:sz="4"/>
+            </w:tcBorders>
+            <w:tcMar>
+              <w:top w:type="dxa" w:w="60"/>
+              <w:left w:type="dxa" w:w="100"/>
+              <w:bottom w:type="dxa" w:w="60"/>
+              <w:right w:type="dxa" w:w="100"/>
+            </w:tcMar>
+          </w:tcPr>
+          <w:p>
+            <w:pPr>
+              <w:spacing w:after="40"/>
             </w:pPr>
             <w:r>
               <w:rPr>
@@ -2032,23 +2045,23 @@
         </w:tc>
         <w:tc>
           <w:tcPr>
-            <w:tcW w:type="dxa" w:w="1050"/>
-            <w:tcBorders>
-              <w:top w:val="single" w:color="999999" w:sz="4"/>
-              <w:left w:val="single" w:color="999999" w:sz="4"/>
-              <w:bottom w:val="single" w:color="999999" w:sz="4"/>
-              <w:right w:val="single" w:color="999999" w:sz="4"/>
-            </w:tcBorders>
-            <w:tcMar>
-              <w:top w:type="dxa" w:w="60"/>
-              <w:left w:type="dxa" w:w="100"/>
-              <w:bottom w:type="dxa" w:w="60"/>
-              <w:right w:type="dxa" w:w="100"/>
-            </w:tcMar>
-          </w:tcPr>
-          <w:p>
-            <w:pPr>
-              <w:jc w:val="center"/>
+            <w:tcW w:type="dxa" w:w="863"/>
+            <w:tcBorders>
+              <w:top w:val="single" w:color="999999" w:sz="4"/>
+              <w:left w:val="single" w:color="999999" w:sz="4"/>
+              <w:bottom w:val="single" w:color="999999" w:sz="4"/>
+              <w:right w:val="single" w:color="999999" w:sz="4"/>
+            </w:tcBorders>
+            <w:tcMar>
+              <w:top w:type="dxa" w:w="60"/>
+              <w:left w:type="dxa" w:w="100"/>
+              <w:bottom w:type="dxa" w:w="60"/>
+              <w:right w:type="dxa" w:w="100"/>
+            </w:tcMar>
+          </w:tcPr>
+          <w:p>
+            <w:pPr>
+              <w:spacing w:after="40"/>
             </w:pPr>
             <w:r>
               <w:rPr>
@@ -2061,23 +2074,23 @@
         </w:tc>
         <w:tc>
           <w:tcPr>
-            <w:tcW w:type="dxa" w:w="2300"/>
-            <w:tcBorders>
-              <w:top w:val="single" w:color="999999" w:sz="4"/>
-              <w:left w:val="single" w:color="999999" w:sz="4"/>
-              <w:bottom w:val="single" w:color="999999" w:sz="4"/>
-              <w:right w:val="single" w:color="999999" w:sz="4"/>
-            </w:tcBorders>
-            <w:tcMar>
-              <w:top w:type="dxa" w:w="60"/>
-              <w:left w:type="dxa" w:w="100"/>
-              <w:bottom w:type="dxa" w:w="60"/>
-              <w:right w:type="dxa" w:w="100"/>
-            </w:tcMar>
-          </w:tcPr>
-          <w:p>
-            <w:pPr>
-              <w:jc w:val="center"/>
+            <w:tcW w:type="dxa" w:w="1648"/>
+            <w:tcBorders>
+              <w:top w:val="single" w:color="999999" w:sz="4"/>
+              <w:left w:val="single" w:color="999999" w:sz="4"/>
+              <w:bottom w:val="single" w:color="999999" w:sz="4"/>
+              <w:right w:val="single" w:color="999999" w:sz="4"/>
+            </w:tcBorders>
+            <w:tcMar>
+              <w:top w:type="dxa" w:w="60"/>
+              <w:left w:type="dxa" w:w="100"/>
+              <w:bottom w:type="dxa" w:w="60"/>
+              <w:right w:type="dxa" w:w="100"/>
+            </w:tcMar>
+          </w:tcPr>
+          <w:p>
+            <w:pPr>
+              <w:spacing w:after="40"/>
             </w:pPr>
             <w:r>
               <w:rPr>
@@ -2091,27 +2104,28 @@
       </w:tr>
       <w:tr>
         <w:trPr>
+          <w:cantSplit/>
           <w:tblHeader w:val="false"/>
         </w:trPr>
         <w:tc>
           <w:tcPr>
-            <w:tcW w:type="dxa" w:w="4641"/>
-            <w:tcBorders>
-              <w:top w:val="single" w:color="999999" w:sz="4"/>
-              <w:left w:val="single" w:color="999999" w:sz="4"/>
-              <w:bottom w:val="single" w:color="999999" w:sz="4"/>
-              <w:right w:val="single" w:color="999999" w:sz="4"/>
-            </w:tcBorders>
-            <w:tcMar>
-              <w:top w:type="dxa" w:w="60"/>
-              <w:left w:type="dxa" w:w="100"/>
-              <w:bottom w:type="dxa" w:w="60"/>
-              <w:right w:type="dxa" w:w="100"/>
-            </w:tcMar>
-          </w:tcPr>
-          <w:p>
-            <w:pPr>
-              <w:jc w:val="left"/>
+            <w:tcW w:type="dxa" w:w="5731"/>
+            <w:tcBorders>
+              <w:top w:val="single" w:color="999999" w:sz="4"/>
+              <w:left w:val="single" w:color="999999" w:sz="4"/>
+              <w:bottom w:val="single" w:color="999999" w:sz="4"/>
+              <w:right w:val="single" w:color="999999" w:sz="4"/>
+            </w:tcBorders>
+            <w:tcMar>
+              <w:top w:type="dxa" w:w="60"/>
+              <w:left w:type="dxa" w:w="100"/>
+              <w:bottom w:type="dxa" w:w="60"/>
+              <w:right w:type="dxa" w:w="100"/>
+            </w:tcMar>
+          </w:tcPr>
+          <w:p>
+            <w:pPr>
+              <w:spacing w:after="40"/>
             </w:pPr>
             <w:r>
               <w:rPr>
@@ -2124,23 +2138,23 @@
         </w:tc>
         <w:tc>
           <w:tcPr>
-            <w:tcW w:type="dxa" w:w="1035"/>
-            <w:tcBorders>
-              <w:top w:val="single" w:color="999999" w:sz="4"/>
-              <w:left w:val="single" w:color="999999" w:sz="4"/>
-              <w:bottom w:val="single" w:color="999999" w:sz="4"/>
-              <w:right w:val="single" w:color="999999" w:sz="4"/>
-            </w:tcBorders>
-            <w:tcMar>
-              <w:top w:type="dxa" w:w="60"/>
-              <w:left w:type="dxa" w:w="100"/>
-              <w:bottom w:type="dxa" w:w="60"/>
-              <w:right w:type="dxa" w:w="100"/>
-            </w:tcMar>
-          </w:tcPr>
-          <w:p>
-            <w:pPr>
-              <w:jc w:val="center"/>
+            <w:tcW w:type="dxa" w:w="784"/>
+            <w:tcBorders>
+              <w:top w:val="single" w:color="999999" w:sz="4"/>
+              <w:left w:val="single" w:color="999999" w:sz="4"/>
+              <w:bottom w:val="single" w:color="999999" w:sz="4"/>
+              <w:right w:val="single" w:color="999999" w:sz="4"/>
+            </w:tcBorders>
+            <w:tcMar>
+              <w:top w:type="dxa" w:w="60"/>
+              <w:left w:type="dxa" w:w="100"/>
+              <w:bottom w:type="dxa" w:w="60"/>
+              <w:right w:type="dxa" w:w="100"/>
+            </w:tcMar>
+          </w:tcPr>
+          <w:p>
+            <w:pPr>
+              <w:spacing w:after="40"/>
             </w:pPr>
             <w:r>
               <w:rPr>
@@ -2153,23 +2167,23 @@
         </w:tc>
         <w:tc>
           <w:tcPr>
-            <w:tcW w:type="dxa" w:w="1050"/>
-            <w:tcBorders>
-              <w:top w:val="single" w:color="999999" w:sz="4"/>
-              <w:left w:val="single" w:color="999999" w:sz="4"/>
-              <w:bottom w:val="single" w:color="999999" w:sz="4"/>
-              <w:right w:val="single" w:color="999999" w:sz="4"/>
-            </w:tcBorders>
-            <w:tcMar>
-              <w:top w:type="dxa" w:w="60"/>
-              <w:left w:type="dxa" w:w="100"/>
-              <w:bottom w:type="dxa" w:w="60"/>
-              <w:right w:type="dxa" w:w="100"/>
-            </w:tcMar>
-          </w:tcPr>
-          <w:p>
-            <w:pPr>
-              <w:jc w:val="center"/>
+            <w:tcW w:type="dxa" w:w="863"/>
+            <w:tcBorders>
+              <w:top w:val="single" w:color="999999" w:sz="4"/>
+              <w:left w:val="single" w:color="999999" w:sz="4"/>
+              <w:bottom w:val="single" w:color="999999" w:sz="4"/>
+              <w:right w:val="single" w:color="999999" w:sz="4"/>
+            </w:tcBorders>
+            <w:tcMar>
+              <w:top w:type="dxa" w:w="60"/>
+              <w:left w:type="dxa" w:w="100"/>
+              <w:bottom w:type="dxa" w:w="60"/>
+              <w:right w:type="dxa" w:w="100"/>
+            </w:tcMar>
+          </w:tcPr>
+          <w:p>
+            <w:pPr>
+              <w:spacing w:after="40"/>
             </w:pPr>
             <w:r>
               <w:rPr>
@@ -2182,23 +2196,23 @@
         </w:tc>
         <w:tc>
           <w:tcPr>
-            <w:tcW w:type="dxa" w:w="2300"/>
-            <w:tcBorders>
-              <w:top w:val="single" w:color="999999" w:sz="4"/>
-              <w:left w:val="single" w:color="999999" w:sz="4"/>
-              <w:bottom w:val="single" w:color="999999" w:sz="4"/>
-              <w:right w:val="single" w:color="999999" w:sz="4"/>
-            </w:tcBorders>
-            <w:tcMar>
-              <w:top w:type="dxa" w:w="60"/>
-              <w:left w:type="dxa" w:w="100"/>
-              <w:bottom w:type="dxa" w:w="60"/>
-              <w:right w:type="dxa" w:w="100"/>
-            </w:tcMar>
-          </w:tcPr>
-          <w:p>
-            <w:pPr>
-              <w:jc w:val="center"/>
+            <w:tcW w:type="dxa" w:w="1648"/>
+            <w:tcBorders>
+              <w:top w:val="single" w:color="999999" w:sz="4"/>
+              <w:left w:val="single" w:color="999999" w:sz="4"/>
+              <w:bottom w:val="single" w:color="999999" w:sz="4"/>
+              <w:right w:val="single" w:color="999999" w:sz="4"/>
+            </w:tcBorders>
+            <w:tcMar>
+              <w:top w:type="dxa" w:w="60"/>
+              <w:left w:type="dxa" w:w="100"/>
+              <w:bottom w:type="dxa" w:w="60"/>
+              <w:right w:type="dxa" w:w="100"/>
+            </w:tcMar>
+          </w:tcPr>
+          <w:p>
+            <w:pPr>
+              <w:spacing w:after="40"/>
             </w:pPr>
             <w:r>
               <w:rPr>
@@ -2212,27 +2226,28 @@
       </w:tr>
       <w:tr>
         <w:trPr>
+          <w:cantSplit/>
           <w:tblHeader w:val="false"/>
         </w:trPr>
         <w:tc>
           <w:tcPr>
-            <w:tcW w:type="dxa" w:w="4641"/>
-            <w:tcBorders>
-              <w:top w:val="single" w:color="999999" w:sz="4"/>
-              <w:left w:val="single" w:color="999999" w:sz="4"/>
-              <w:bottom w:val="single" w:color="999999" w:sz="4"/>
-              <w:right w:val="single" w:color="999999" w:sz="4"/>
-            </w:tcBorders>
-            <w:tcMar>
-              <w:top w:type="dxa" w:w="60"/>
-              <w:left w:type="dxa" w:w="100"/>
-              <w:bottom w:type="dxa" w:w="60"/>
-              <w:right w:type="dxa" w:w="100"/>
-            </w:tcMar>
-          </w:tcPr>
-          <w:p>
-            <w:pPr>
-              <w:jc w:val="left"/>
+            <w:tcW w:type="dxa" w:w="5731"/>
+            <w:tcBorders>
+              <w:top w:val="single" w:color="999999" w:sz="4"/>
+              <w:left w:val="single" w:color="999999" w:sz="4"/>
+              <w:bottom w:val="single" w:color="999999" w:sz="4"/>
+              <w:right w:val="single" w:color="999999" w:sz="4"/>
+            </w:tcBorders>
+            <w:tcMar>
+              <w:top w:type="dxa" w:w="60"/>
+              <w:left w:type="dxa" w:w="100"/>
+              <w:bottom w:type="dxa" w:w="60"/>
+              <w:right w:type="dxa" w:w="100"/>
+            </w:tcMar>
+          </w:tcPr>
+          <w:p>
+            <w:pPr>
+              <w:spacing w:after="40"/>
             </w:pPr>
             <w:r>
               <w:rPr>
@@ -2245,23 +2260,23 @@
         </w:tc>
         <w:tc>
           <w:tcPr>
-            <w:tcW w:type="dxa" w:w="1035"/>
-            <w:tcBorders>
-              <w:top w:val="single" w:color="999999" w:sz="4"/>
-              <w:left w:val="single" w:color="999999" w:sz="4"/>
-              <w:bottom w:val="single" w:color="999999" w:sz="4"/>
-              <w:right w:val="single" w:color="999999" w:sz="4"/>
-            </w:tcBorders>
-            <w:tcMar>
-              <w:top w:type="dxa" w:w="60"/>
-              <w:left w:type="dxa" w:w="100"/>
-              <w:bottom w:type="dxa" w:w="60"/>
-              <w:right w:type="dxa" w:w="100"/>
-            </w:tcMar>
-          </w:tcPr>
-          <w:p>
-            <w:pPr>
-              <w:jc w:val="center"/>
+            <w:tcW w:type="dxa" w:w="784"/>
+            <w:tcBorders>
+              <w:top w:val="single" w:color="999999" w:sz="4"/>
+              <w:left w:val="single" w:color="999999" w:sz="4"/>
+              <w:bottom w:val="single" w:color="999999" w:sz="4"/>
+              <w:right w:val="single" w:color="999999" w:sz="4"/>
+            </w:tcBorders>
+            <w:tcMar>
+              <w:top w:type="dxa" w:w="60"/>
+              <w:left w:type="dxa" w:w="100"/>
+              <w:bottom w:type="dxa" w:w="60"/>
+              <w:right w:type="dxa" w:w="100"/>
+            </w:tcMar>
+          </w:tcPr>
+          <w:p>
+            <w:pPr>
+              <w:spacing w:after="40"/>
             </w:pPr>
             <w:r>
               <w:rPr>
@@ -2274,23 +2289,23 @@
         </w:tc>
         <w:tc>
           <w:tcPr>
-            <w:tcW w:type="dxa" w:w="1050"/>
-            <w:tcBorders>
-              <w:top w:val="single" w:color="999999" w:sz="4"/>
-              <w:left w:val="single" w:color="999999" w:sz="4"/>
-              <w:bottom w:val="single" w:color="999999" w:sz="4"/>
-              <w:right w:val="single" w:color="999999" w:sz="4"/>
-            </w:tcBorders>
-            <w:tcMar>
-              <w:top w:type="dxa" w:w="60"/>
-              <w:left w:type="dxa" w:w="100"/>
-              <w:bottom w:type="dxa" w:w="60"/>
-              <w:right w:type="dxa" w:w="100"/>
-            </w:tcMar>
-          </w:tcPr>
-          <w:p>
-            <w:pPr>
-              <w:jc w:val="center"/>
+            <w:tcW w:type="dxa" w:w="863"/>
+            <w:tcBorders>
+              <w:top w:val="single" w:color="999999" w:sz="4"/>
+              <w:left w:val="single" w:color="999999" w:sz="4"/>
+              <w:bottom w:val="single" w:color="999999" w:sz="4"/>
+              <w:right w:val="single" w:color="999999" w:sz="4"/>
+            </w:tcBorders>
+            <w:tcMar>
+              <w:top w:type="dxa" w:w="60"/>
+              <w:left w:type="dxa" w:w="100"/>
+              <w:bottom w:type="dxa" w:w="60"/>
+              <w:right w:type="dxa" w:w="100"/>
+            </w:tcMar>
+          </w:tcPr>
+          <w:p>
+            <w:pPr>
+              <w:spacing w:after="40"/>
             </w:pPr>
             <w:r>
               <w:rPr>
@@ -2303,23 +2318,23 @@
         </w:tc>
         <w:tc>
           <w:tcPr>
-            <w:tcW w:type="dxa" w:w="2300"/>
-            <w:tcBorders>
-              <w:top w:val="single" w:color="999999" w:sz="4"/>
-              <w:left w:val="single" w:color="999999" w:sz="4"/>
-              <w:bottom w:val="single" w:color="999999" w:sz="4"/>
-              <w:right w:val="single" w:color="999999" w:sz="4"/>
-            </w:tcBorders>
-            <w:tcMar>
-              <w:top w:type="dxa" w:w="60"/>
-              <w:left w:type="dxa" w:w="100"/>
-              <w:bottom w:type="dxa" w:w="60"/>
-              <w:right w:type="dxa" w:w="100"/>
-            </w:tcMar>
-          </w:tcPr>
-          <w:p>
-            <w:pPr>
-              <w:jc w:val="center"/>
+            <w:tcW w:type="dxa" w:w="1648"/>
+            <w:tcBorders>
+              <w:top w:val="single" w:color="999999" w:sz="4"/>
+              <w:left w:val="single" w:color="999999" w:sz="4"/>
+              <w:bottom w:val="single" w:color="999999" w:sz="4"/>
+              <w:right w:val="single" w:color="999999" w:sz="4"/>
+            </w:tcBorders>
+            <w:tcMar>
+              <w:top w:type="dxa" w:w="60"/>
+              <w:left w:type="dxa" w:w="100"/>
+              <w:bottom w:type="dxa" w:w="60"/>
+              <w:right w:type="dxa" w:w="100"/>
+            </w:tcMar>
+          </w:tcPr>
+          <w:p>
+            <w:pPr>
+              <w:spacing w:after="40"/>
             </w:pPr>
             <w:r>
               <w:rPr>
@@ -3591,7 +3606,7 @@
           <w:i/>
           <w:iCs/>
         </w:rPr>
-        <w:t xml:space="preserve">"The first time she nearly fainted, I sat her back, legs up, checked her. I didn't write 'refused'. I wrote 'dizzy on standing, BP [low], retry after fluids and analgesia'. The second time we did it slowly, longer sitting first, and she walked to the bathroom."</w:t>
+        <w:t xml:space="preserve">"The first time she nearly fainted, I sat her back, legs up, checked her. I didn't write 'refused'. I wrote 'dizzy on standing, BP [low], retry after fluids and analgesia' … The second time we did it slowly, longer sitting first, and she walked to the bathroom."</w:t>
       </w:r>
       <w:r>
         <w:t xml:space="preserve"> (N01, 5–10 years)</w:t>
@@ -4091,8 +4106,8 @@
           <w:ilvl w:val="0"/>
           <w:numId w:val="2"/>
         </w:numPr>
-        <w:spacing w:after="120" w:line="360"/>
-        <w:jc w:val="both"/>
+        <w:spacing w:after="100" w:line="300"/>
+        <w:jc w:val="left"/>
       </w:pPr>
       <w:r>
         <w:rPr>
@@ -4112,8 +4127,8 @@
           <w:ilvl w:val="0"/>
           <w:numId w:val="2"/>
         </w:numPr>
-        <w:spacing w:after="120" w:line="360"/>
-        <w:jc w:val="both"/>
+        <w:spacing w:after="100" w:line="300"/>
+        <w:jc w:val="left"/>
       </w:pPr>
       <w:r>
         <w:rPr>
@@ -4133,8 +4148,8 @@
           <w:ilvl w:val="0"/>
           <w:numId w:val="2"/>
         </w:numPr>
-        <w:spacing w:after="120" w:line="360"/>
-        <w:jc w:val="both"/>
+        <w:spacing w:after="100" w:line="300"/>
+        <w:jc w:val="left"/>
       </w:pPr>
       <w:r>
         <w:rPr>
@@ -4188,6 +4203,7 @@
       </w:tblGrid>
       <w:tr>
         <w:trPr>
+          <w:cantSplit w:val="false"/>
           <w:tblHeader/>
         </w:trPr>
         <w:tc>
@@ -4209,7 +4225,7 @@
           </w:tcPr>
           <w:p>
             <w:pPr>
-              <w:jc w:val="left"/>
+              <w:spacing w:after="40"/>
             </w:pPr>
             <w:r>
               <w:rPr>
@@ -4241,7 +4257,7 @@
           </w:tcPr>
           <w:p>
             <w:pPr>
-              <w:jc w:val="left"/>
+              <w:spacing w:after="40"/>
             </w:pPr>
             <w:r>
               <w:rPr>
@@ -4273,7 +4289,7 @@
           </w:tcPr>
           <w:p>
             <w:pPr>
-              <w:jc w:val="left"/>
+              <w:spacing w:after="40"/>
             </w:pPr>
             <w:r>
               <w:rPr>
@@ -4289,6 +4305,7 @@
       </w:tr>
       <w:tr>
         <w:trPr>
+          <w:cantSplit/>
           <w:tblHeader w:val="false"/>
         </w:trPr>
         <w:tc>
@@ -4309,7 +4326,7 @@
           </w:tcPr>
           <w:p>
             <w:pPr>
-              <w:jc w:val="left"/>
+              <w:spacing w:after="40"/>
             </w:pPr>
             <w:r>
               <w:rPr>
@@ -4338,7 +4355,7 @@
           </w:tcPr>
           <w:p>
             <w:pPr>
-              <w:jc w:val="left"/>
+              <w:spacing w:after="40"/>
             </w:pPr>
             <w:r>
               <w:rPr>
@@ -4367,7 +4384,7 @@
           </w:tcPr>
           <w:p>
             <w:pPr>
-              <w:jc w:val="left"/>
+              <w:spacing w:after="40"/>
             </w:pPr>
             <w:r>
               <w:rPr>
@@ -4381,6 +4398,7 @@
       </w:tr>
       <w:tr>
         <w:trPr>
+          <w:cantSplit/>
           <w:tblHeader w:val="false"/>
         </w:trPr>
         <w:tc>
@@ -4401,7 +4419,7 @@
           </w:tcPr>
           <w:p>
             <w:pPr>
-              <w:jc w:val="left"/>
+              <w:spacing w:after="40"/>
             </w:pPr>
             <w:r>
               <w:rPr>
@@ -4430,7 +4448,7 @@
           </w:tcPr>
           <w:p>
             <w:pPr>
-              <w:jc w:val="left"/>
+              <w:spacing w:after="40"/>
             </w:pPr>
             <w:r>
               <w:rPr>
@@ -4459,7 +4477,7 @@
           </w:tcPr>
           <w:p>
             <w:pPr>
-              <w:jc w:val="left"/>
+              <w:spacing w:after="40"/>
             </w:pPr>
             <w:r>
               <w:rPr>
@@ -4473,6 +4491,7 @@
       </w:tr>
       <w:tr>
         <w:trPr>
+          <w:cantSplit/>
           <w:tblHeader w:val="false"/>
         </w:trPr>
         <w:tc>
@@ -4493,7 +4512,7 @@
           </w:tcPr>
           <w:p>
             <w:pPr>
-              <w:jc w:val="left"/>
+              <w:spacing w:after="40"/>
             </w:pPr>
             <w:r>
               <w:rPr>
@@ -4522,7 +4541,7 @@
           </w:tcPr>
           <w:p>
             <w:pPr>
-              <w:jc w:val="left"/>
+              <w:spacing w:after="40"/>
             </w:pPr>
             <w:r>
               <w:rPr>
@@ -4551,7 +4570,7 @@
           </w:tcPr>
           <w:p>
             <w:pPr>
-              <w:jc w:val="left"/>
+              <w:spacing w:after="40"/>
             </w:pPr>
             <w:r>
               <w:rPr>
@@ -4589,14 +4608,16 @@
     </w:p>
     <w:p>
       <w:pPr>
-        <w:pStyle w:val="ListParagraph"/>
-        <w:numPr>
-          <w:ilvl w:val="0"/>
-          <w:numId w:val="3"/>
-        </w:numPr>
-        <w:spacing w:after="120" w:line="360"/>
-        <w:jc w:val="both"/>
-      </w:pPr>
+        <w:tabs>
+          <w:tab w:val="left" w:pos="720"/>
+        </w:tabs>
+        <w:spacing w:after="120" w:line="320"/>
+        <w:ind w:left="720" w:hanging="360"/>
+        <w:jc w:val="both"/>
+      </w:pPr>
+      <w:r>
+        <w:t xml:space="preserve">1.	</w:t>
+      </w:r>
       <w:r>
         <w:rPr>
           <w:b/>
@@ -4630,14 +4651,16 @@
     </w:p>
     <w:p>
       <w:pPr>
-        <w:pStyle w:val="ListParagraph"/>
-        <w:numPr>
-          <w:ilvl w:val="0"/>
-          <w:numId w:val="3"/>
-        </w:numPr>
-        <w:spacing w:after="120" w:line="360"/>
-        <w:jc w:val="both"/>
-      </w:pPr>
+        <w:tabs>
+          <w:tab w:val="left" w:pos="720"/>
+        </w:tabs>
+        <w:spacing w:after="120" w:line="320"/>
+        <w:ind w:left="720" w:hanging="360"/>
+        <w:jc w:val="both"/>
+      </w:pPr>
+      <w:r>
+        <w:t xml:space="preserve">2.	</w:t>
+      </w:r>
       <w:r>
         <w:rPr>
           <w:b/>
@@ -4651,14 +4674,16 @@
     </w:p>
     <w:p>
       <w:pPr>
-        <w:pStyle w:val="ListParagraph"/>
-        <w:numPr>
-          <w:ilvl w:val="0"/>
-          <w:numId w:val="3"/>
-        </w:numPr>
-        <w:spacing w:after="120" w:line="360"/>
-        <w:jc w:val="both"/>
-      </w:pPr>
+        <w:tabs>
+          <w:tab w:val="left" w:pos="720"/>
+        </w:tabs>
+        <w:spacing w:after="120" w:line="320"/>
+        <w:ind w:left="720" w:hanging="360"/>
+        <w:jc w:val="both"/>
+      </w:pPr>
+      <w:r>
+        <w:t xml:space="preserve">3.	</w:t>
+      </w:r>
       <w:r>
         <w:rPr>
           <w:b/>
@@ -4742,6 +4767,7 @@
       </w:tblGrid>
       <w:tr>
         <w:trPr>
+          <w:cantSplit w:val="false"/>
           <w:tblHeader/>
         </w:trPr>
         <w:tc>
@@ -4763,7 +4789,7 @@
           </w:tcPr>
           <w:p>
             <w:pPr>
-              <w:jc w:val="left"/>
+              <w:spacing w:after="40"/>
             </w:pPr>
             <w:r>
               <w:rPr>
@@ -4795,7 +4821,7 @@
           </w:tcPr>
           <w:p>
             <w:pPr>
-              <w:jc w:val="left"/>
+              <w:spacing w:after="40"/>
             </w:pPr>
             <w:r>
               <w:rPr>
@@ -4811,6 +4837,7 @@
       </w:tr>
       <w:tr>
         <w:trPr>
+          <w:cantSplit/>
           <w:tblHeader w:val="false"/>
         </w:trPr>
         <w:tc>
@@ -4831,7 +4858,7 @@
           </w:tcPr>
           <w:p>
             <w:pPr>
-              <w:jc w:val="left"/>
+              <w:spacing w:after="40"/>
             </w:pPr>
             <w:r>
               <w:rPr>
@@ -4860,7 +4887,7 @@
           </w:tcPr>
           <w:p>
             <w:pPr>
-              <w:jc w:val="left"/>
+              <w:spacing w:after="40"/>
             </w:pPr>
             <w:r>
               <w:rPr>
@@ -4874,6 +4901,7 @@
       </w:tr>
       <w:tr>
         <w:trPr>
+          <w:cantSplit/>
           <w:tblHeader w:val="false"/>
         </w:trPr>
         <w:tc>
@@ -4894,7 +4922,7 @@
           </w:tcPr>
           <w:p>
             <w:pPr>
-              <w:jc w:val="left"/>
+              <w:spacing w:after="40"/>
             </w:pPr>
             <w:r>
               <w:rPr>
@@ -4923,7 +4951,7 @@
           </w:tcPr>
           <w:p>
             <w:pPr>
-              <w:jc w:val="left"/>
+              <w:spacing w:after="40"/>
             </w:pPr>
             <w:r>
               <w:rPr>
@@ -4937,6 +4965,7 @@
       </w:tr>
       <w:tr>
         <w:trPr>
+          <w:cantSplit/>
           <w:tblHeader w:val="false"/>
         </w:trPr>
         <w:tc>
@@ -4957,7 +4986,7 @@
           </w:tcPr>
           <w:p>
             <w:pPr>
-              <w:jc w:val="left"/>
+              <w:spacing w:after="40"/>
             </w:pPr>
             <w:r>
               <w:rPr>
@@ -4986,7 +5015,7 @@
           </w:tcPr>
           <w:p>
             <w:pPr>
-              <w:jc w:val="left"/>
+              <w:spacing w:after="40"/>
             </w:pPr>
             <w:r>
               <w:rPr>
@@ -5000,6 +5029,7 @@
       </w:tr>
       <w:tr>
         <w:trPr>
+          <w:cantSplit/>
           <w:tblHeader w:val="false"/>
         </w:trPr>
         <w:tc>
@@ -5020,7 +5050,7 @@
           </w:tcPr>
           <w:p>
             <w:pPr>
-              <w:jc w:val="left"/>
+              <w:spacing w:after="40"/>
             </w:pPr>
             <w:r>
               <w:rPr>
@@ -5049,7 +5079,7 @@
           </w:tcPr>
           <w:p>
             <w:pPr>
-              <w:jc w:val="left"/>
+              <w:spacing w:after="40"/>
             </w:pPr>
             <w:r>
               <w:rPr>
@@ -5079,6 +5109,7 @@
       </w:tr>
       <w:tr>
         <w:trPr>
+          <w:cantSplit/>
           <w:tblHeader w:val="false"/>
         </w:trPr>
         <w:tc>
@@ -5099,7 +5130,7 @@
           </w:tcPr>
           <w:p>
             <w:pPr>
-              <w:jc w:val="left"/>
+              <w:spacing w:after="40"/>
             </w:pPr>
             <w:r>
               <w:rPr>
@@ -5128,7 +5159,7 @@
           </w:tcPr>
           <w:p>
             <w:pPr>
-              <w:jc w:val="left"/>
+              <w:spacing w:after="40"/>
             </w:pPr>
             <w:r>
               <w:rPr>
@@ -5142,6 +5173,7 @@
       </w:tr>
       <w:tr>
         <w:trPr>
+          <w:cantSplit/>
           <w:tblHeader w:val="false"/>
         </w:trPr>
         <w:tc>
@@ -5162,7 +5194,7 @@
           </w:tcPr>
           <w:p>
             <w:pPr>
-              <w:jc w:val="left"/>
+              <w:spacing w:after="40"/>
             </w:pPr>
             <w:r>
               <w:rPr>
@@ -5191,7 +5223,7 @@
           </w:tcPr>
           <w:p>
             <w:pPr>
-              <w:jc w:val="left"/>
+              <w:spacing w:after="40"/>
             </w:pPr>
             <w:r>
               <w:rPr>
@@ -5205,6 +5237,7 @@
       </w:tr>
       <w:tr>
         <w:trPr>
+          <w:cantSplit/>
           <w:tblHeader w:val="false"/>
         </w:trPr>
         <w:tc>
@@ -5225,7 +5258,7 @@
           </w:tcPr>
           <w:p>
             <w:pPr>
-              <w:jc w:val="left"/>
+              <w:spacing w:after="40"/>
             </w:pPr>
             <w:r>
               <w:rPr>
@@ -5254,7 +5287,7 @@
           </w:tcPr>
           <w:p>
             <w:pPr>
-              <w:jc w:val="left"/>
+              <w:spacing w:after="40"/>
             </w:pPr>
             <w:r>
               <w:rPr>
@@ -5268,6 +5301,7 @@
       </w:tr>
       <w:tr>
         <w:trPr>
+          <w:cantSplit/>
           <w:tblHeader w:val="false"/>
         </w:trPr>
         <w:tc>
@@ -5288,7 +5322,7 @@
           </w:tcPr>
           <w:p>
             <w:pPr>
-              <w:jc w:val="left"/>
+              <w:spacing w:after="40"/>
             </w:pPr>
             <w:r>
               <w:rPr>
@@ -5317,7 +5351,7 @@
           </w:tcPr>
           <w:p>
             <w:pPr>
-              <w:jc w:val="left"/>
+              <w:spacing w:after="40"/>
             </w:pPr>
             <w:r>
               <w:rPr>
@@ -5347,6 +5381,7 @@
       </w:tr>
       <w:tr>
         <w:trPr>
+          <w:cantSplit/>
           <w:tblHeader w:val="false"/>
         </w:trPr>
         <w:tc>
@@ -5367,7 +5402,7 @@
           </w:tcPr>
           <w:p>
             <w:pPr>
-              <w:jc w:val="left"/>
+              <w:spacing w:after="40"/>
             </w:pPr>
             <w:r>
               <w:rPr>
@@ -5396,7 +5431,7 @@
           </w:tcPr>
           <w:p>
             <w:pPr>
-              <w:jc w:val="left"/>
+              <w:spacing w:after="40"/>
             </w:pPr>
             <w:r>
               <w:rPr>
@@ -5410,6 +5445,7 @@
       </w:tr>
       <w:tr>
         <w:trPr>
+          <w:cantSplit/>
           <w:tblHeader w:val="false"/>
         </w:trPr>
         <w:tc>
@@ -5430,7 +5466,7 @@
           </w:tcPr>
           <w:p>
             <w:pPr>
-              <w:jc w:val="left"/>
+              <w:spacing w:after="40"/>
             </w:pPr>
             <w:r>
               <w:rPr>
@@ -5459,7 +5495,7 @@
           </w:tcPr>
           <w:p>
             <w:pPr>
-              <w:jc w:val="left"/>
+              <w:spacing w:after="40"/>
             </w:pPr>
             <w:r>
               <w:rPr>
@@ -5473,6 +5509,7 @@
       </w:tr>
       <w:tr>
         <w:trPr>
+          <w:cantSplit/>
           <w:tblHeader w:val="false"/>
         </w:trPr>
         <w:tc>
@@ -5493,7 +5530,7 @@
           </w:tcPr>
           <w:p>
             <w:pPr>
-              <w:jc w:val="left"/>
+              <w:spacing w:after="40"/>
             </w:pPr>
             <w:r>
               <w:rPr>
@@ -5522,7 +5559,7 @@
           </w:tcPr>
           <w:p>
             <w:pPr>
-              <w:jc w:val="left"/>
+              <w:spacing w:after="40"/>
             </w:pPr>
             <w:r>
               <w:rPr>
@@ -5536,6 +5573,7 @@
       </w:tr>
       <w:tr>
         <w:trPr>
+          <w:cantSplit/>
           <w:tblHeader w:val="false"/>
         </w:trPr>
         <w:tc>
@@ -5556,7 +5594,7 @@
           </w:tcPr>
           <w:p>
             <w:pPr>
-              <w:jc w:val="left"/>
+              <w:spacing w:after="40"/>
             </w:pPr>
             <w:r>
               <w:rPr>
@@ -5585,7 +5623,7 @@
           </w:tcPr>
           <w:p>
             <w:pPr>
-              <w:jc w:val="left"/>
+              <w:spacing w:after="40"/>
             </w:pPr>
             <w:r>
               <w:rPr>
@@ -5599,6 +5637,7 @@
       </w:tr>
       <w:tr>
         <w:trPr>
+          <w:cantSplit/>
           <w:tblHeader w:val="false"/>
         </w:trPr>
         <w:tc>
@@ -5619,7 +5658,7 @@
           </w:tcPr>
           <w:p>
             <w:pPr>
-              <w:jc w:val="left"/>
+              <w:spacing w:after="40"/>
             </w:pPr>
             <w:r>
               <w:rPr>
@@ -5648,7 +5687,7 @@
           </w:tcPr>
           <w:p>
             <w:pPr>
-              <w:jc w:val="left"/>
+              <w:spacing w:after="40"/>
             </w:pPr>
             <w:r>
               <w:rPr>
@@ -5697,17 +5736,18 @@
         </w:tblBorders>
       </w:tblPr>
       <w:tblGrid>
-        <w:gridCol w:w="2256"/>
-        <w:gridCol w:w="4796"/>
-        <w:gridCol w:w="1974"/>
+        <w:gridCol w:w="2406"/>
+        <w:gridCol w:w="5116"/>
+        <w:gridCol w:w="1504"/>
       </w:tblGrid>
       <w:tr>
         <w:trPr>
+          <w:cantSplit w:val="false"/>
           <w:tblHeader/>
         </w:trPr>
         <w:tc>
           <w:tcPr>
-            <w:tcW w:type="dxa" w:w="2256"/>
+            <w:tcW w:type="dxa" w:w="2406"/>
             <w:tcBorders>
               <w:top w:val="single" w:color="999999" w:sz="4"/>
               <w:left w:val="single" w:color="999999" w:sz="4"/>
@@ -5724,7 +5764,7 @@
           </w:tcPr>
           <w:p>
             <w:pPr>
-              <w:jc w:val="left"/>
+              <w:spacing w:after="40"/>
             </w:pPr>
             <w:r>
               <w:rPr>
@@ -5739,7 +5779,7 @@
         </w:tc>
         <w:tc>
           <w:tcPr>
-            <w:tcW w:type="dxa" w:w="4796"/>
+            <w:tcW w:type="dxa" w:w="5116"/>
             <w:tcBorders>
               <w:top w:val="single" w:color="999999" w:sz="4"/>
               <w:left w:val="single" w:color="999999" w:sz="4"/>
@@ -5756,7 +5796,7 @@
           </w:tcPr>
           <w:p>
             <w:pPr>
-              <w:jc w:val="left"/>
+              <w:spacing w:after="40"/>
             </w:pPr>
             <w:r>
               <w:rPr>
@@ -5771,7 +5811,7 @@
         </w:tc>
         <w:tc>
           <w:tcPr>
-            <w:tcW w:type="dxa" w:w="1974"/>
+            <w:tcW w:type="dxa" w:w="1504"/>
             <w:tcBorders>
               <w:top w:val="single" w:color="999999" w:sz="4"/>
               <w:left w:val="single" w:color="999999" w:sz="4"/>
@@ -5788,7 +5828,7 @@
           </w:tcPr>
           <w:p>
             <w:pPr>
-              <w:jc w:val="left"/>
+              <w:spacing w:after="40"/>
             </w:pPr>
             <w:r>
               <w:rPr>
@@ -5804,27 +5844,28 @@
       </w:tr>
       <w:tr>
         <w:trPr>
+          <w:cantSplit/>
           <w:tblHeader w:val="false"/>
         </w:trPr>
         <w:tc>
           <w:tcPr>
-            <w:tcW w:type="dxa" w:w="2256"/>
-            <w:tcBorders>
-              <w:top w:val="single" w:color="999999" w:sz="4"/>
-              <w:left w:val="single" w:color="999999" w:sz="4"/>
-              <w:bottom w:val="single" w:color="999999" w:sz="4"/>
-              <w:right w:val="single" w:color="999999" w:sz="4"/>
-            </w:tcBorders>
-            <w:tcMar>
-              <w:top w:type="dxa" w:w="60"/>
-              <w:left w:type="dxa" w:w="100"/>
-              <w:bottom w:type="dxa" w:w="60"/>
-              <w:right w:type="dxa" w:w="100"/>
-            </w:tcMar>
-          </w:tcPr>
-          <w:p>
-            <w:pPr>
-              <w:jc w:val="left"/>
+            <w:tcW w:type="dxa" w:w="2406"/>
+            <w:tcBorders>
+              <w:top w:val="single" w:color="999999" w:sz="4"/>
+              <w:left w:val="single" w:color="999999" w:sz="4"/>
+              <w:bottom w:val="single" w:color="999999" w:sz="4"/>
+              <w:right w:val="single" w:color="999999" w:sz="4"/>
+            </w:tcBorders>
+            <w:tcMar>
+              <w:top w:type="dxa" w:w="60"/>
+              <w:left w:type="dxa" w:w="100"/>
+              <w:bottom w:type="dxa" w:w="60"/>
+              <w:right w:type="dxa" w:w="100"/>
+            </w:tcMar>
+          </w:tcPr>
+          <w:p>
+            <w:pPr>
+              <w:spacing w:after="40"/>
             </w:pPr>
             <w:r>
               <w:rPr>
@@ -5837,23 +5878,23 @@
         </w:tc>
         <w:tc>
           <w:tcPr>
-            <w:tcW w:type="dxa" w:w="4796"/>
-            <w:tcBorders>
-              <w:top w:val="single" w:color="999999" w:sz="4"/>
-              <w:left w:val="single" w:color="999999" w:sz="4"/>
-              <w:bottom w:val="single" w:color="999999" w:sz="4"/>
-              <w:right w:val="single" w:color="999999" w:sz="4"/>
-            </w:tcBorders>
-            <w:tcMar>
-              <w:top w:type="dxa" w:w="60"/>
-              <w:left w:type="dxa" w:w="100"/>
-              <w:bottom w:type="dxa" w:w="60"/>
-              <w:right w:type="dxa" w:w="100"/>
-            </w:tcMar>
-          </w:tcPr>
-          <w:p>
-            <w:pPr>
-              <w:jc w:val="left"/>
+            <w:tcW w:type="dxa" w:w="5116"/>
+            <w:tcBorders>
+              <w:top w:val="single" w:color="999999" w:sz="4"/>
+              <w:left w:val="single" w:color="999999" w:sz="4"/>
+              <w:bottom w:val="single" w:color="999999" w:sz="4"/>
+              <w:right w:val="single" w:color="999999" w:sz="4"/>
+            </w:tcBorders>
+            <w:tcMar>
+              <w:top w:type="dxa" w:w="60"/>
+              <w:left w:type="dxa" w:w="100"/>
+              <w:bottom w:type="dxa" w:w="60"/>
+              <w:right w:type="dxa" w:w="100"/>
+            </w:tcMar>
+          </w:tcPr>
+          <w:p>
+            <w:pPr>
+              <w:spacing w:after="40"/>
             </w:pPr>
             <w:r>
               <w:rPr>
@@ -5866,23 +5907,23 @@
         </w:tc>
         <w:tc>
           <w:tcPr>
-            <w:tcW w:type="dxa" w:w="1974"/>
-            <w:tcBorders>
-              <w:top w:val="single" w:color="999999" w:sz="4"/>
-              <w:left w:val="single" w:color="999999" w:sz="4"/>
-              <w:bottom w:val="single" w:color="999999" w:sz="4"/>
-              <w:right w:val="single" w:color="999999" w:sz="4"/>
-            </w:tcBorders>
-            <w:tcMar>
-              <w:top w:type="dxa" w:w="60"/>
-              <w:left w:type="dxa" w:w="100"/>
-              <w:bottom w:type="dxa" w:w="60"/>
-              <w:right w:type="dxa" w:w="100"/>
-            </w:tcMar>
-          </w:tcPr>
-          <w:p>
-            <w:pPr>
-              <w:jc w:val="left"/>
+            <w:tcW w:type="dxa" w:w="1504"/>
+            <w:tcBorders>
+              <w:top w:val="single" w:color="999999" w:sz="4"/>
+              <w:left w:val="single" w:color="999999" w:sz="4"/>
+              <w:bottom w:val="single" w:color="999999" w:sz="4"/>
+              <w:right w:val="single" w:color="999999" w:sz="4"/>
+            </w:tcBorders>
+            <w:tcMar>
+              <w:top w:type="dxa" w:w="60"/>
+              <w:left w:type="dxa" w:w="100"/>
+              <w:bottom w:type="dxa" w:w="60"/>
+              <w:right w:type="dxa" w:w="100"/>
+            </w:tcMar>
+          </w:tcPr>
+          <w:p>
+            <w:pPr>
+              <w:spacing w:after="40"/>
             </w:pPr>
             <w:r>
               <w:rPr>
@@ -5896,27 +5937,28 @@
       </w:tr>
       <w:tr>
         <w:trPr>
+          <w:cantSplit/>
           <w:tblHeader w:val="false"/>
         </w:trPr>
         <w:tc>
           <w:tcPr>
-            <w:tcW w:type="dxa" w:w="2256"/>
-            <w:tcBorders>
-              <w:top w:val="single" w:color="999999" w:sz="4"/>
-              <w:left w:val="single" w:color="999999" w:sz="4"/>
-              <w:bottom w:val="single" w:color="999999" w:sz="4"/>
-              <w:right w:val="single" w:color="999999" w:sz="4"/>
-            </w:tcBorders>
-            <w:tcMar>
-              <w:top w:type="dxa" w:w="60"/>
-              <w:left w:type="dxa" w:w="100"/>
-              <w:bottom w:type="dxa" w:w="60"/>
-              <w:right w:type="dxa" w:w="100"/>
-            </w:tcMar>
-          </w:tcPr>
-          <w:p>
-            <w:pPr>
-              <w:jc w:val="left"/>
+            <w:tcW w:type="dxa" w:w="2406"/>
+            <w:tcBorders>
+              <w:top w:val="single" w:color="999999" w:sz="4"/>
+              <w:left w:val="single" w:color="999999" w:sz="4"/>
+              <w:bottom w:val="single" w:color="999999" w:sz="4"/>
+              <w:right w:val="single" w:color="999999" w:sz="4"/>
+            </w:tcBorders>
+            <w:tcMar>
+              <w:top w:type="dxa" w:w="60"/>
+              <w:left w:type="dxa" w:w="100"/>
+              <w:bottom w:type="dxa" w:w="60"/>
+              <w:right w:type="dxa" w:w="100"/>
+            </w:tcMar>
+          </w:tcPr>
+          <w:p>
+            <w:pPr>
+              <w:spacing w:after="40"/>
             </w:pPr>
             <w:r>
               <w:rPr>
@@ -5929,23 +5971,23 @@
         </w:tc>
         <w:tc>
           <w:tcPr>
-            <w:tcW w:type="dxa" w:w="4796"/>
-            <w:tcBorders>
-              <w:top w:val="single" w:color="999999" w:sz="4"/>
-              <w:left w:val="single" w:color="999999" w:sz="4"/>
-              <w:bottom w:val="single" w:color="999999" w:sz="4"/>
-              <w:right w:val="single" w:color="999999" w:sz="4"/>
-            </w:tcBorders>
-            <w:tcMar>
-              <w:top w:type="dxa" w:w="60"/>
-              <w:left w:type="dxa" w:w="100"/>
-              <w:bottom w:type="dxa" w:w="60"/>
-              <w:right w:type="dxa" w:w="100"/>
-            </w:tcMar>
-          </w:tcPr>
-          <w:p>
-            <w:pPr>
-              <w:jc w:val="left"/>
+            <w:tcW w:type="dxa" w:w="5116"/>
+            <w:tcBorders>
+              <w:top w:val="single" w:color="999999" w:sz="4"/>
+              <w:left w:val="single" w:color="999999" w:sz="4"/>
+              <w:bottom w:val="single" w:color="999999" w:sz="4"/>
+              <w:right w:val="single" w:color="999999" w:sz="4"/>
+            </w:tcBorders>
+            <w:tcMar>
+              <w:top w:type="dxa" w:w="60"/>
+              <w:left w:type="dxa" w:w="100"/>
+              <w:bottom w:type="dxa" w:w="60"/>
+              <w:right w:type="dxa" w:w="100"/>
+            </w:tcMar>
+          </w:tcPr>
+          <w:p>
+            <w:pPr>
+              <w:spacing w:after="40"/>
             </w:pPr>
             <w:r>
               <w:rPr>
@@ -5958,23 +6000,23 @@
         </w:tc>
         <w:tc>
           <w:tcPr>
-            <w:tcW w:type="dxa" w:w="1974"/>
-            <w:tcBorders>
-              <w:top w:val="single" w:color="999999" w:sz="4"/>
-              <w:left w:val="single" w:color="999999" w:sz="4"/>
-              <w:bottom w:val="single" w:color="999999" w:sz="4"/>
-              <w:right w:val="single" w:color="999999" w:sz="4"/>
-            </w:tcBorders>
-            <w:tcMar>
-              <w:top w:type="dxa" w:w="60"/>
-              <w:left w:type="dxa" w:w="100"/>
-              <w:bottom w:type="dxa" w:w="60"/>
-              <w:right w:type="dxa" w:w="100"/>
-            </w:tcMar>
-          </w:tcPr>
-          <w:p>
-            <w:pPr>
-              <w:jc w:val="left"/>
+            <w:tcW w:type="dxa" w:w="1504"/>
+            <w:tcBorders>
+              <w:top w:val="single" w:color="999999" w:sz="4"/>
+              <w:left w:val="single" w:color="999999" w:sz="4"/>
+              <w:bottom w:val="single" w:color="999999" w:sz="4"/>
+              <w:right w:val="single" w:color="999999" w:sz="4"/>
+            </w:tcBorders>
+            <w:tcMar>
+              <w:top w:type="dxa" w:w="60"/>
+              <w:left w:type="dxa" w:w="100"/>
+              <w:bottom w:type="dxa" w:w="60"/>
+              <w:right w:type="dxa" w:w="100"/>
+            </w:tcMar>
+          </w:tcPr>
+          <w:p>
+            <w:pPr>
+              <w:spacing w:after="40"/>
             </w:pPr>
             <w:r>
               <w:rPr>
@@ -5988,27 +6030,28 @@
       </w:tr>
       <w:tr>
         <w:trPr>
+          <w:cantSplit/>
           <w:tblHeader w:val="false"/>
         </w:trPr>
         <w:tc>
           <w:tcPr>
-            <w:tcW w:type="dxa" w:w="2256"/>
-            <w:tcBorders>
-              <w:top w:val="single" w:color="999999" w:sz="4"/>
-              <w:left w:val="single" w:color="999999" w:sz="4"/>
-              <w:bottom w:val="single" w:color="999999" w:sz="4"/>
-              <w:right w:val="single" w:color="999999" w:sz="4"/>
-            </w:tcBorders>
-            <w:tcMar>
-              <w:top w:type="dxa" w:w="60"/>
-              <w:left w:type="dxa" w:w="100"/>
-              <w:bottom w:type="dxa" w:w="60"/>
-              <w:right w:type="dxa" w:w="100"/>
-            </w:tcMar>
-          </w:tcPr>
-          <w:p>
-            <w:pPr>
-              <w:jc w:val="left"/>
+            <w:tcW w:type="dxa" w:w="2406"/>
+            <w:tcBorders>
+              <w:top w:val="single" w:color="999999" w:sz="4"/>
+              <w:left w:val="single" w:color="999999" w:sz="4"/>
+              <w:bottom w:val="single" w:color="999999" w:sz="4"/>
+              <w:right w:val="single" w:color="999999" w:sz="4"/>
+            </w:tcBorders>
+            <w:tcMar>
+              <w:top w:type="dxa" w:w="60"/>
+              <w:left w:type="dxa" w:w="100"/>
+              <w:bottom w:type="dxa" w:w="60"/>
+              <w:right w:type="dxa" w:w="100"/>
+            </w:tcMar>
+          </w:tcPr>
+          <w:p>
+            <w:pPr>
+              <w:spacing w:after="40"/>
             </w:pPr>
             <w:r>
               <w:rPr>
@@ -6021,23 +6064,23 @@
         </w:tc>
         <w:tc>
           <w:tcPr>
-            <w:tcW w:type="dxa" w:w="4796"/>
-            <w:tcBorders>
-              <w:top w:val="single" w:color="999999" w:sz="4"/>
-              <w:left w:val="single" w:color="999999" w:sz="4"/>
-              <w:bottom w:val="single" w:color="999999" w:sz="4"/>
-              <w:right w:val="single" w:color="999999" w:sz="4"/>
-            </w:tcBorders>
-            <w:tcMar>
-              <w:top w:type="dxa" w:w="60"/>
-              <w:left w:type="dxa" w:w="100"/>
-              <w:bottom w:type="dxa" w:w="60"/>
-              <w:right w:type="dxa" w:w="100"/>
-            </w:tcMar>
-          </w:tcPr>
-          <w:p>
-            <w:pPr>
-              <w:jc w:val="left"/>
+            <w:tcW w:type="dxa" w:w="5116"/>
+            <w:tcBorders>
+              <w:top w:val="single" w:color="999999" w:sz="4"/>
+              <w:left w:val="single" w:color="999999" w:sz="4"/>
+              <w:bottom w:val="single" w:color="999999" w:sz="4"/>
+              <w:right w:val="single" w:color="999999" w:sz="4"/>
+            </w:tcBorders>
+            <w:tcMar>
+              <w:top w:type="dxa" w:w="60"/>
+              <w:left w:type="dxa" w:w="100"/>
+              <w:bottom w:type="dxa" w:w="60"/>
+              <w:right w:type="dxa" w:w="100"/>
+            </w:tcMar>
+          </w:tcPr>
+          <w:p>
+            <w:pPr>
+              <w:spacing w:after="40"/>
             </w:pPr>
             <w:r>
               <w:rPr>
@@ -6050,23 +6093,23 @@
         </w:tc>
         <w:tc>
           <w:tcPr>
-            <w:tcW w:type="dxa" w:w="1974"/>
-            <w:tcBorders>
-              <w:top w:val="single" w:color="999999" w:sz="4"/>
-              <w:left w:val="single" w:color="999999" w:sz="4"/>
-              <w:bottom w:val="single" w:color="999999" w:sz="4"/>
-              <w:right w:val="single" w:color="999999" w:sz="4"/>
-            </w:tcBorders>
-            <w:tcMar>
-              <w:top w:type="dxa" w:w="60"/>
-              <w:left w:type="dxa" w:w="100"/>
-              <w:bottom w:type="dxa" w:w="60"/>
-              <w:right w:type="dxa" w:w="100"/>
-            </w:tcMar>
-          </w:tcPr>
-          <w:p>
-            <w:pPr>
-              <w:jc w:val="left"/>
+            <w:tcW w:type="dxa" w:w="1504"/>
+            <w:tcBorders>
+              <w:top w:val="single" w:color="999999" w:sz="4"/>
+              <w:left w:val="single" w:color="999999" w:sz="4"/>
+              <w:bottom w:val="single" w:color="999999" w:sz="4"/>
+              <w:right w:val="single" w:color="999999" w:sz="4"/>
+            </w:tcBorders>
+            <w:tcMar>
+              <w:top w:type="dxa" w:w="60"/>
+              <w:left w:type="dxa" w:w="100"/>
+              <w:bottom w:type="dxa" w:w="60"/>
+              <w:right w:type="dxa" w:w="100"/>
+            </w:tcMar>
+          </w:tcPr>
+          <w:p>
+            <w:pPr>
+              <w:spacing w:after="40"/>
             </w:pPr>
             <w:r>
               <w:rPr>
@@ -6114,14 +6157,16 @@
     </w:p>
     <w:p>
       <w:pPr>
-        <w:pStyle w:val="ListParagraph"/>
-        <w:numPr>
-          <w:ilvl w:val="0"/>
-          <w:numId w:val="4"/>
-        </w:numPr>
-        <w:spacing w:after="120" w:line="360"/>
-        <w:jc w:val="both"/>
-      </w:pPr>
+        <w:tabs>
+          <w:tab w:val="left" w:pos="720"/>
+        </w:tabs>
+        <w:spacing w:after="120" w:line="320"/>
+        <w:ind w:left="720" w:hanging="360"/>
+        <w:jc w:val="both"/>
+      </w:pPr>
+      <w:r>
+        <w:t xml:space="preserve">1.	</w:t>
+      </w:r>
       <w:r>
         <w:rPr>
           <w:b/>
@@ -6135,14 +6180,16 @@
     </w:p>
     <w:p>
       <w:pPr>
-        <w:pStyle w:val="ListParagraph"/>
-        <w:numPr>
-          <w:ilvl w:val="0"/>
-          <w:numId w:val="4"/>
-        </w:numPr>
-        <w:spacing w:after="120" w:line="360"/>
-        <w:jc w:val="both"/>
-      </w:pPr>
+        <w:tabs>
+          <w:tab w:val="left" w:pos="720"/>
+        </w:tabs>
+        <w:spacing w:after="120" w:line="320"/>
+        <w:ind w:left="720" w:hanging="360"/>
+        <w:jc w:val="both"/>
+      </w:pPr>
+      <w:r>
+        <w:t xml:space="preserve">2.	</w:t>
+      </w:r>
       <w:r>
         <w:rPr>
           <w:b/>
@@ -6156,14 +6203,16 @@
     </w:p>
     <w:p>
       <w:pPr>
-        <w:pStyle w:val="ListParagraph"/>
-        <w:numPr>
-          <w:ilvl w:val="0"/>
-          <w:numId w:val="4"/>
-        </w:numPr>
-        <w:spacing w:after="120" w:line="360"/>
-        <w:jc w:val="both"/>
-      </w:pPr>
+        <w:tabs>
+          <w:tab w:val="left" w:pos="720"/>
+        </w:tabs>
+        <w:spacing w:after="120" w:line="320"/>
+        <w:ind w:left="720" w:hanging="360"/>
+        <w:jc w:val="both"/>
+      </w:pPr>
+      <w:r>
+        <w:t xml:space="preserve">3.	</w:t>
+      </w:r>
       <w:r>
         <w:rPr>
           <w:b/>
@@ -6172,7 +6221,7 @@
         <w:t xml:space="preserve">Clinical attachments.</w:t>
       </w:r>
       <w:r>
-        <w:t xml:space="preserve"> The Methods list attachments in nursing assessment, but no participant characteristic or site profile describes catheter or infusion removal practices. If attachments feature in the findings (as in 3.3.1), Supplementary Table S3 should cover them.</w:t>
+        <w:t xml:space="preserve"> The Methods list attachments in nursing assessment, but nothing in Sections 1–2 describes catheter or infusion practices, although attachments feature in the findings (3.3.1). The supplementary Table S3 provided with this exercise now covers them, including the gap between written procedure and reported practice.</w:t>
       </w:r>
     </w:p>
     <w:sectPr>
@@ -6407,23 +6456,20 @@
     <w:multiLevelType w:val="hybridMultilevel"/>
     <w:lvl w:ilvl="0" w15:tentative="1">
       <w:start w:val="1"/>
-      <w:numFmt w:val="decimal"/>
-      <w:lvlText w:val="%1."/>
-      <w:lvlJc w:val="left"/>
-      <w:pPr>
-        <w:ind w:left="720" w:hanging="360"/>
-      </w:pPr>
-    </w:lvl>
-  </w:abstractNum>
-  <w:abstractNum w:abstractNumId="4" w15:restartNumberingAfterBreak="0">
-    <w:multiLevelType w:val="hybridMultilevel"/>
-    <w:lvl w:ilvl="0" w15:tentative="1">
-      <w:start w:val="1"/>
       <w:numFmt w:val="bullet"/>
       <w:lvlText w:val="•"/>
       <w:lvlJc w:val="left"/>
       <w:pPr>
         <w:ind w:left="720" w:hanging="360"/>
+      </w:pPr>
+    </w:lvl>
+    <w:lvl w:ilvl="1" w15:tentative="1">
+      <w:start w:val="1"/>
+      <w:numFmt w:val="bullet"/>
+      <w:lvlText w:val="–"/>
+      <w:lvlJc w:val="left"/>
+      <w:pPr>
+        <w:ind w:left="1440" w:hanging="360"/>
       </w:pPr>
     </w:lvl>
   </w:abstractNum>
@@ -6434,18 +6480,6 @@
     </w:lvlOverride>
   </w:num>
   <w:num w:numId="2">
-    <w:abstractNumId w:val="4"/>
-    <w:lvlOverride w:ilvl="0">
-      <w:startOverride w:val="1"/>
-    </w:lvlOverride>
-  </w:num>
-  <w:num w:numId="3">
-    <w:abstractNumId w:val="2"/>
-    <w:lvlOverride w:ilvl="0">
-      <w:startOverride w:val="1"/>
-    </w:lvlOverride>
-  </w:num>
-  <w:num w:numId="4">
     <w:abstractNumId w:val="3"/>
     <w:lvlOverride w:ilvl="0">
       <w:startOverride w:val="1"/>

</xml_diff>